<commit_message>
Add early IPAC files
</commit_message>
<xml_diff>
--- a/2025/Дисс.совет/Документы/Сергей/Колокольчиков_информационная_справка.docx
+++ b/2025/Дисс.совет/Документы/Сергей/Колокольчиков_информационная_справка.docx
@@ -1157,12 +1157,19 @@
                 <w:rFonts w:ascii="Times New Roman" w:hAnsi="Times New Roman"/>
               </w:rPr>
             </w:pPr>
-            <w:r>
-              <w:rPr>
-                <w:rFonts w:ascii="Times New Roman" w:hAnsi="Times New Roman" w:cs="Times New Roman"/>
-                <w:color w:val="auto"/>
-              </w:rPr>
-              <w:t>Парамонов Валентин Витальевич</w:t>
+            <w:proofErr w:type="spellStart"/>
+            <w:r>
+              <w:rPr>
+                <w:rFonts w:ascii="Times New Roman" w:hAnsi="Times New Roman"/>
+              </w:rPr>
+              <w:t>Шведунов</w:t>
+            </w:r>
+            <w:proofErr w:type="spellEnd"/>
+            <w:r>
+              <w:rPr>
+                <w:rFonts w:ascii="Times New Roman" w:hAnsi="Times New Roman"/>
+              </w:rPr>
+              <w:t xml:space="preserve"> Василий Иванович</w:t>
             </w:r>
           </w:p>
         </w:tc>
@@ -1265,7 +1272,7 @@
                 <w:rFonts w:ascii="Times New Roman" w:hAnsi="Times New Roman" w:cs="Times New Roman"/>
                 <w:color w:val="auto"/>
               </w:rPr>
-              <w:t>ИЯИ РАН</w:t>
+              <w:t>МГУ</w:t>
             </w:r>
           </w:p>
         </w:tc>
@@ -1298,14 +1305,7 @@
                 <w:rFonts w:ascii="Times New Roman" w:hAnsi="Times New Roman" w:cs="Times New Roman"/>
                 <w:color w:val="auto"/>
               </w:rPr>
-              <w:t>ведущий</w:t>
-            </w:r>
-            <w:r>
-              <w:rPr>
-                <w:rFonts w:ascii="Times New Roman" w:hAnsi="Times New Roman" w:cs="Times New Roman"/>
-                <w:color w:val="auto"/>
-              </w:rPr>
-              <w:t xml:space="preserve"> научный сотрудник</w:t>
+              <w:t>главный научный сотрудник</w:t>
             </w:r>
           </w:p>
         </w:tc>
@@ -2061,7 +2061,14 @@
                 <w:rFonts w:ascii="Times New Roman" w:hAnsi="Times New Roman" w:cs="Times New Roman"/>
                 <w:color w:val="auto"/>
               </w:rPr>
-              <w:t>к. физ.-мат. наук</w:t>
+              <w:t xml:space="preserve">к. физ.-мат. </w:t>
+            </w:r>
+            <w:r>
+              <w:rPr>
+                <w:rFonts w:ascii="Times New Roman" w:hAnsi="Times New Roman" w:cs="Times New Roman"/>
+                <w:color w:val="auto"/>
+              </w:rPr>
+              <w:t>н.</w:t>
             </w:r>
           </w:p>
         </w:tc>
@@ -2459,7 +2466,7 @@
                 <w:sz w:val="24"/>
                 <w:szCs w:val="24"/>
               </w:rPr>
-              <w:t xml:space="preserve">Молчанов </w:t>
+              <w:t>Моча</w:t>
             </w:r>
             <w:r>
               <w:rPr>
@@ -2467,7 +2474,7 @@
                 <w:sz w:val="24"/>
                 <w:szCs w:val="24"/>
               </w:rPr>
-              <w:t>Васили</w:t>
+              <w:t>л</w:t>
             </w:r>
             <w:r>
               <w:rPr>
@@ -2475,7 +2482,7 @@
                 <w:sz w:val="24"/>
                 <w:szCs w:val="24"/>
               </w:rPr>
-              <w:t>й</w:t>
+              <w:t xml:space="preserve">ов </w:t>
             </w:r>
             <w:r>
               <w:rPr>
@@ -2483,7 +2490,7 @@
                 <w:sz w:val="24"/>
                 <w:szCs w:val="24"/>
               </w:rPr>
-              <w:t xml:space="preserve"> Вадимови</w:t>
+              <w:t>Васили</w:t>
             </w:r>
             <w:r>
               <w:rPr>
@@ -2491,6 +2498,22 @@
                 <w:sz w:val="24"/>
                 <w:szCs w:val="24"/>
               </w:rPr>
+              <w:t>й</w:t>
+            </w:r>
+            <w:r>
+              <w:rPr>
+                <w:rFonts w:ascii="Times New Roman" w:hAnsi="Times New Roman" w:cs="Times New Roman"/>
+                <w:sz w:val="24"/>
+                <w:szCs w:val="24"/>
+              </w:rPr>
+              <w:t xml:space="preserve"> Вадимови</w:t>
+            </w:r>
+            <w:r>
+              <w:rPr>
+                <w:rFonts w:ascii="Times New Roman" w:hAnsi="Times New Roman" w:cs="Times New Roman"/>
+                <w:sz w:val="24"/>
+                <w:szCs w:val="24"/>
+              </w:rPr>
               <w:t>ч</w:t>
             </w:r>
           </w:p>
@@ -2525,7 +2548,7 @@
                 <w:rFonts w:ascii="Times New Roman" w:hAnsi="Times New Roman" w:cs="Times New Roman"/>
                 <w:color w:val="auto"/>
               </w:rPr>
-              <w:t>доктор физико-математических наук</w:t>
+              <w:t>д. физ.-мат. н.</w:t>
             </w:r>
           </w:p>
         </w:tc>
@@ -2588,15 +2611,45 @@
                 <w:highlight w:val="red"/>
               </w:rPr>
             </w:pPr>
-            <w:bookmarkStart w:id="0" w:name="_Hlk208669326"/>
-            <w:r>
-              <w:rPr>
-                <w:rFonts w:ascii="Times New Roman" w:hAnsi="Times New Roman" w:cs="Times New Roman"/>
-                <w:color w:val="auto"/>
-              </w:rPr>
-              <w:t>Федеральное государственное бюджетное учреждение Национальный исследовательский центр «Курчатовский институт», Курчатовский комплекс теоретической и экспериментальной физики</w:t>
-            </w:r>
-            <w:bookmarkEnd w:id="0"/>
+            <w:r>
+              <w:rPr>
+                <w:rFonts w:ascii="Times New Roman" w:hAnsi="Times New Roman" w:cs="Times New Roman"/>
+                <w:color w:val="auto"/>
+              </w:rPr>
+              <w:t xml:space="preserve">Федеральное государственное бюджетное учреждение «Институт физики высоких энергий имени </w:t>
+            </w:r>
+            <w:proofErr w:type="spellStart"/>
+            <w:r>
+              <w:rPr>
+                <w:rFonts w:ascii="Times New Roman" w:hAnsi="Times New Roman" w:cs="Times New Roman"/>
+                <w:color w:val="auto"/>
+              </w:rPr>
+              <w:t>А.А.Логунова</w:t>
+            </w:r>
+            <w:proofErr w:type="spellEnd"/>
+            <w:r>
+              <w:rPr>
+                <w:rFonts w:ascii="Times New Roman" w:hAnsi="Times New Roman" w:cs="Times New Roman"/>
+                <w:color w:val="auto"/>
+              </w:rPr>
+              <w:t xml:space="preserve"> Национального исследовательского </w:t>
+            </w:r>
+            <w:proofErr w:type="gramStart"/>
+            <w:r>
+              <w:rPr>
+                <w:rFonts w:ascii="Times New Roman" w:hAnsi="Times New Roman" w:cs="Times New Roman"/>
+                <w:color w:val="auto"/>
+              </w:rPr>
+              <w:t>центра ”Курчатовский</w:t>
+            </w:r>
+            <w:proofErr w:type="gramEnd"/>
+            <w:r>
+              <w:rPr>
+                <w:rFonts w:ascii="Times New Roman" w:hAnsi="Times New Roman" w:cs="Times New Roman"/>
+                <w:color w:val="auto"/>
+              </w:rPr>
+              <w:t xml:space="preserve"> институт”»</w:t>
+            </w:r>
           </w:p>
         </w:tc>
         <w:tc>
@@ -2665,7 +2718,7 @@
                 <w:rFonts w:ascii="Times New Roman" w:hAnsi="Times New Roman" w:cs="Times New Roman"/>
                 <w:color w:val="auto"/>
               </w:rPr>
-              <w:t>Филатов Юрий Николаевич</w:t>
+              <w:t>Кулевой Тимур Вячеславович</w:t>
             </w:r>
           </w:p>
         </w:tc>
@@ -2695,17 +2748,10 @@
             </w:pPr>
             <w:r>
               <w:rPr>
-                <w:rFonts w:ascii="Times New Roman" w:hAnsi="Times New Roman" w:cs="Times New Roman"/>
-                <w:color w:val="auto"/>
-              </w:rPr>
-              <w:t>кандидат</w:t>
-            </w:r>
-            <w:r>
-              <w:rPr>
-                <w:rFonts w:ascii="Times New Roman" w:hAnsi="Times New Roman" w:cs="Times New Roman"/>
-                <w:color w:val="auto"/>
-              </w:rPr>
-              <w:t xml:space="preserve"> физико-математических наук</w:t>
+                <w:rFonts w:ascii="Times New Roman" w:hAnsi="Times New Roman"/>
+                <w:color w:val="auto"/>
+              </w:rPr>
+              <w:t>д. техн. наук</w:t>
             </w:r>
           </w:p>
         </w:tc>
@@ -2775,7 +2821,7 @@
                 <w:sz w:val="24"/>
                 <w:szCs w:val="24"/>
               </w:rPr>
-              <w:t>Федеральное государственное автономное образовательное учреждение высшего образования “Московский физико-технический институт (национальный исследовательский университет)”</w:t>
+              <w:t>Федеральное государственное бюджетное учреждение Национальный исследовательский центр «Курчатовский институт», Курчатовский комплекс теоретической и экспериментальной физики</w:t>
             </w:r>
           </w:p>
         </w:tc>
@@ -2807,7 +2853,7 @@
               <w:rPr>
                 <w:rFonts w:ascii="Times New Roman" w:hAnsi="Times New Roman"/>
               </w:rPr>
-              <w:t>заведующий лабораторией, ведущий научный сотрудник</w:t>
+              <w:t>заместитель руководителя Комплекса по прикладным научным исследованиям и экспериментальным установкам</w:t>
             </w:r>
           </w:p>
         </w:tc>
@@ -3539,7 +3585,7 @@
                 <w:sz w:val="24"/>
                 <w:szCs w:val="24"/>
               </w:rPr>
-              <w:t>Объединенный институт ядерных исследований</w:t>
+              <w:t>Федеральное государственное бюджетное образовательное учреждение высшего образования «Санкт-Петербургский государственный университет»</w:t>
             </w:r>
           </w:p>
         </w:tc>
@@ -3572,7 +3618,16 @@
                 <w:b w:val="0"/>
                 <w:shd w:val="clear" w:color="auto" w:fill="FFFFFF"/>
               </w:rPr>
-              <w:t>Бюджетное учреждение</w:t>
+              <w:t>б</w:t>
+            </w:r>
+            <w:r>
+              <w:rPr>
+                <w:rStyle w:val="a5"/>
+                <w:rFonts w:ascii="Times New Roman" w:hAnsi="Times New Roman"/>
+                <w:b w:val="0"/>
+                <w:shd w:val="clear" w:color="auto" w:fill="FFFFFF"/>
+              </w:rPr>
+              <w:t>юджетное учреждение</w:t>
             </w:r>
           </w:p>
         </w:tc>
@@ -3606,7 +3661,7 @@
                 <w:sz w:val="24"/>
                 <w:szCs w:val="24"/>
               </w:rPr>
-              <w:t>Международная межправительственная организация</w:t>
+              <w:t>Правительство Российской Федерации</w:t>
             </w:r>
           </w:p>
         </w:tc>
@@ -3631,17 +3686,74 @@
               <w:spacing w:after="0" w:line="240" w:lineRule="auto"/>
               <w:ind w:firstLine="228"/>
               <w:jc w:val="center"/>
-              <w:rPr>
-                <w:rFonts w:ascii="Times New Roman" w:hAnsi="Times New Roman" w:cs="Times New Roman"/>
-                <w:color w:val="auto"/>
-              </w:rPr>
-            </w:pPr>
-            <w:r>
-              <w:rPr>
-                <w:rFonts w:ascii="Times New Roman" w:hAnsi="Times New Roman" w:cs="Times New Roman"/>
-                <w:color w:val="auto"/>
-              </w:rPr>
-              <w:t xml:space="preserve">141980, Российская Федерация, Дубна, Московская обл., ул. </w:t>
+            </w:pPr>
+            <w:r>
+              <w:rPr>
+                <w:rFonts w:ascii="Times New Roman" w:hAnsi="Times New Roman" w:cs="Times New Roman"/>
+                <w:color w:val="auto"/>
+              </w:rPr>
+              <w:tab/>
+              <w:t>Россия, 199034, Санкт-Петербург, Университетская наб., д. 7–9</w:t>
+            </w:r>
+            <w:r>
+              <w:rPr>
+                <w:rFonts w:ascii="Times New Roman" w:hAnsi="Times New Roman" w:cs="Times New Roman"/>
+                <w:color w:val="auto"/>
+              </w:rPr>
+              <w:br/>
+            </w:r>
+            <w:r>
+              <w:rPr>
+                <w:rFonts w:ascii="Times New Roman" w:hAnsi="Times New Roman" w:cs="Times New Roman"/>
+                <w:color w:val="auto"/>
+              </w:rPr>
+              <w:t>тел.</w:t>
+            </w:r>
+            <w:r>
+              <w:rPr>
+                <w:rFonts w:ascii="Times New Roman" w:hAnsi="Times New Roman" w:cs="Times New Roman"/>
+                <w:color w:val="auto"/>
+              </w:rPr>
+              <w:t xml:space="preserve"> </w:t>
+            </w:r>
+            <w:r>
+              <w:rPr>
+                <w:rFonts w:ascii="Times New Roman" w:hAnsi="Times New Roman" w:cs="Times New Roman"/>
+                <w:color w:val="auto"/>
+              </w:rPr>
+              <w:t>+7 (812) 325–87–36</w:t>
+            </w:r>
+            <w:r>
+              <w:rPr>
+                <w:rFonts w:ascii="Times New Roman" w:hAnsi="Times New Roman" w:cs="Times New Roman"/>
+                <w:color w:val="auto"/>
+              </w:rPr>
+              <w:t>, эл. почт</w:t>
+            </w:r>
+            <w:r>
+              <w:rPr>
+                <w:rFonts w:ascii="Times New Roman" w:hAnsi="Times New Roman" w:cs="Times New Roman"/>
+                <w:color w:val="auto"/>
+              </w:rPr>
+              <w:t>а</w:t>
+            </w:r>
+            <w:r>
+              <w:t xml:space="preserve"> </w:t>
+            </w:r>
+            <w:r>
+              <w:rPr>
+                <w:rFonts w:ascii="Times New Roman" w:hAnsi="Times New Roman" w:cs="Times New Roman"/>
+                <w:color w:val="auto"/>
+              </w:rPr>
+              <w:tab/>
+              <w:t>spbu@spbu.ru</w:t>
+            </w:r>
+            <w:r>
+              <w:rPr>
+                <w:rFonts w:ascii="Times New Roman" w:hAnsi="Times New Roman" w:cs="Times New Roman"/>
+                <w:color w:val="auto"/>
+              </w:rPr>
+              <w:t xml:space="preserve">, сайт </w:t>
             </w:r>
             <w:proofErr w:type="spellStart"/>
             <w:r>
@@ -3649,7 +3761,7 @@
                 <w:rFonts w:ascii="Times New Roman" w:hAnsi="Times New Roman" w:cs="Times New Roman"/>
                 <w:color w:val="auto"/>
               </w:rPr>
-              <w:t>Жолио</w:t>
+              <w:t>www</w:t>
             </w:r>
             <w:proofErr w:type="spellEnd"/>
             <w:r>
@@ -3657,59 +3769,17 @@
                 <w:rFonts w:ascii="Times New Roman" w:hAnsi="Times New Roman" w:cs="Times New Roman"/>
                 <w:color w:val="auto"/>
               </w:rPr>
-              <w:t xml:space="preserve">-Кюри, д.6. </w:t>
-            </w:r>
-          </w:p>
-          <w:p>
-            <w:pPr>
-              <w:widowControl w:val="0"/>
-              <w:spacing w:after="0" w:line="240" w:lineRule="auto"/>
-              <w:ind w:firstLine="228"/>
-              <w:jc w:val="center"/>
-            </w:pPr>
-            <w:r>
-              <w:rPr>
-                <w:rFonts w:ascii="Times New Roman" w:hAnsi="Times New Roman" w:cs="Times New Roman"/>
-                <w:color w:val="auto"/>
-              </w:rPr>
-              <w:t>тел. (496) 216-50-59, эл. почт</w:t>
-            </w:r>
-            <w:r>
-              <w:rPr>
-                <w:rFonts w:ascii="Times New Roman" w:hAnsi="Times New Roman" w:cs="Times New Roman"/>
-                <w:color w:val="auto"/>
-              </w:rPr>
-              <w:t>а</w:t>
-            </w:r>
-            <w:r>
-              <w:rPr>
-                <w:rFonts w:ascii="Times New Roman" w:hAnsi="Times New Roman" w:cs="Times New Roman"/>
-                <w:color w:val="auto"/>
-              </w:rPr>
+              <w:t>.</w:t>
+            </w:r>
+            <w:r>
               <w:t xml:space="preserve"> </w:t>
             </w:r>
-            <w:hyperlink r:id="rId7" w:history="1">
-              <w:r>
-                <w:rPr>
-                  <w:rStyle w:val="a3"/>
-                  <w:rFonts w:ascii="Times New Roman" w:hAnsi="Times New Roman" w:cs="Times New Roman"/>
-                </w:rPr>
-                <w:t>post@jinr.ru</w:t>
-              </w:r>
-            </w:hyperlink>
-            <w:r>
-              <w:rPr>
-                <w:rFonts w:ascii="Times New Roman" w:hAnsi="Times New Roman" w:cs="Times New Roman"/>
-                <w:color w:val="auto"/>
-              </w:rPr>
-              <w:t xml:space="preserve">, сайт </w:t>
-            </w:r>
-            <w:r>
-              <w:rPr>
-                <w:rFonts w:ascii="Times New Roman" w:hAnsi="Times New Roman" w:cs="Times New Roman"/>
-                <w:color w:val="auto"/>
-              </w:rPr>
-              <w:t>www.jinr.ru</w:t>
+            <w:r>
+              <w:rPr>
+                <w:rFonts w:ascii="Times New Roman" w:hAnsi="Times New Roman" w:cs="Times New Roman"/>
+                <w:color w:val="auto"/>
+              </w:rPr>
+              <w:t>spbu.ru</w:t>
             </w:r>
           </w:p>
         </w:tc>
@@ -4020,7 +4090,7 @@
               <w:rPr>
                 <w:rFonts w:ascii="Times New Roman" w:hAnsi="Times New Roman"/>
               </w:rPr>
-              <w:t>Трубников Григорий Владимирович</w:t>
+              <w:t>Сергей Владимирович Микушев</w:t>
             </w:r>
           </w:p>
         </w:tc>
@@ -4051,22 +4121,9 @@
             <w:r>
               <w:rPr>
                 <w:rFonts w:ascii="Times New Roman" w:hAnsi="Times New Roman" w:cs="Times New Roman"/>
-                <w:color w:val="000000" w:themeColor="text1"/>
-              </w:rPr>
-              <w:t xml:space="preserve">доктор </w:t>
-            </w:r>
-            <w:r>
-              <w:rPr>
-                <w:rFonts w:ascii="Times New Roman" w:hAnsi="Times New Roman" w:cs="Times New Roman"/>
-              </w:rPr>
-              <w:t>физико-математических</w:t>
-            </w:r>
-            <w:r>
-              <w:rPr>
-                <w:rFonts w:ascii="Times New Roman" w:hAnsi="Times New Roman" w:cs="Times New Roman"/>
-                <w:color w:val="000000" w:themeColor="text1"/>
-              </w:rPr>
-              <w:t xml:space="preserve"> наук</w:t>
+                <w:color w:val="auto"/>
+              </w:rPr>
+              <w:t>к. физ.-мат. н.</w:t>
             </w:r>
           </w:p>
         </w:tc>
@@ -4098,9 +4155,8 @@
             <w:r>
               <w:rPr>
                 <w:rFonts w:ascii="Times New Roman" w:hAnsi="Times New Roman" w:cs="Times New Roman"/>
-                <w:color w:val="auto"/>
-              </w:rPr>
-              <w:t>академик РАН</w:t>
+              </w:rPr>
+              <w:t>без звания</w:t>
             </w:r>
           </w:p>
         </w:tc>
@@ -4135,15 +4191,7 @@
                 <w:sz w:val="24"/>
                 <w:szCs w:val="24"/>
               </w:rPr>
-              <w:t>Международная межправительственная организация Объединенный институт ядерных исследований</w:t>
-            </w:r>
-            <w:r>
-              <w:rPr>
-                <w:rFonts w:ascii="Times New Roman" w:hAnsi="Times New Roman" w:cs="Times New Roman"/>
-                <w:sz w:val="24"/>
-                <w:szCs w:val="24"/>
-              </w:rPr>
-              <w:t xml:space="preserve"> (ОИЯИ)</w:t>
+              <w:t>Федеральное государственное бюджетное образовательное учреждение высшего образования «Санкт-Петербургский государственный университет»</w:t>
             </w:r>
           </w:p>
         </w:tc>
@@ -4177,7 +4225,14 @@
                 <w:rFonts w:ascii="Times New Roman" w:hAnsi="Times New Roman" w:cs="Times New Roman"/>
                 <w:color w:val="auto"/>
               </w:rPr>
-              <w:t>директор</w:t>
+              <w:t>п</w:t>
+            </w:r>
+            <w:r>
+              <w:rPr>
+                <w:rFonts w:ascii="Times New Roman" w:hAnsi="Times New Roman" w:cs="Times New Roman"/>
+                <w:color w:val="auto"/>
+              </w:rPr>
+              <w:t>роректор по научной работе</w:t>
             </w:r>
           </w:p>
         </w:tc>

</xml_diff>